<commit_message>
finalized checkpoint 4.1 (typos etc.)
</commit_message>
<xml_diff>
--- a/Checkpoint 4.1/Required_Capstone_Checkpoint_4_1_Worksheet.docx
+++ b/Checkpoint 4.1/Required_Capstone_Checkpoint_4_1_Worksheet.docx
@@ -985,7 +985,21 @@
                 <w:sz w:val="24"/>
                 <w:szCs w:val="24"/>
               </w:rPr>
-              <w:t>6 “Was Charles II born before his mother’s reign began</w:t>
+              <w:t>6 “Was Charles II</w:t>
+            </w:r>
+            <w:r>
+              <w:rPr>
+                <w:sz w:val="24"/>
+                <w:szCs w:val="24"/>
+              </w:rPr>
+              <w:t>I</w:t>
+            </w:r>
+            <w:r>
+              <w:rPr>
+                <w:sz w:val="24"/>
+                <w:szCs w:val="24"/>
+              </w:rPr>
+              <w:t xml:space="preserve"> born before his mother’s reign began</w:t>
             </w:r>
             <w:r>
               <w:rPr>
@@ -1113,7 +1127,7 @@
               </w:rPr>
               <w:lastRenderedPageBreak/>
               <w:drawing>
-                <wp:inline distT="0" distB="0" distL="0" distR="0" wp14:anchorId="51390516" wp14:editId="5EE5D6F2">
+                <wp:inline distT="0" distB="0" distL="0" distR="0" wp14:anchorId="51390516" wp14:editId="1CC7271D">
                   <wp:extent cx="6263640" cy="2776855"/>
                   <wp:effectExtent l="0" t="0" r="3810" b="4445"/>
                   <wp:docPr id="1049600252" name="Picture 3"/>
@@ -1308,7 +1322,7 @@
               </w:rPr>
               <w:lastRenderedPageBreak/>
               <w:drawing>
-                <wp:inline distT="0" distB="0" distL="0" distR="0" wp14:anchorId="373EAB2A" wp14:editId="27B4D1EA">
+                <wp:inline distT="0" distB="0" distL="0" distR="0" wp14:anchorId="373EAB2A" wp14:editId="42BE621F">
                   <wp:extent cx="6263640" cy="2655570"/>
                   <wp:effectExtent l="0" t="0" r="3810" b="0"/>
                   <wp:docPr id="60505092" name="Picture 5"/>
@@ -1405,7 +1419,7 @@
               </w:rPr>
               <w:lastRenderedPageBreak/>
               <w:drawing>
-                <wp:inline distT="0" distB="0" distL="0" distR="0" wp14:anchorId="4443CD63" wp14:editId="7F562ACC">
+                <wp:inline distT="0" distB="0" distL="0" distR="0" wp14:anchorId="4443CD63" wp14:editId="5C083AA3">
                   <wp:extent cx="6263640" cy="2251075"/>
                   <wp:effectExtent l="0" t="0" r="3810" b="0"/>
                   <wp:docPr id="758361962" name="Picture 9"/>
@@ -1631,7 +1645,7 @@
               </w:rPr>
               <w:lastRenderedPageBreak/>
               <w:drawing>
-                <wp:inline distT="0" distB="0" distL="0" distR="0" wp14:anchorId="7DDF3AC8" wp14:editId="7C8E6F71">
+                <wp:inline distT="0" distB="0" distL="0" distR="0" wp14:anchorId="7DDF3AC8" wp14:editId="021E35F2">
                   <wp:extent cx="6263640" cy="2803525"/>
                   <wp:effectExtent l="0" t="0" r="3810" b="0"/>
                   <wp:docPr id="821881091" name="Picture 11"/>
@@ -2058,7 +2072,21 @@
                 <w:sz w:val="24"/>
                 <w:szCs w:val="24"/>
               </w:rPr>
-              <w:t>G16 “Was Charles II born before his mother’s reign began?”</w:t>
+              <w:t>G16 “Was Charles II</w:t>
+            </w:r>
+            <w:r>
+              <w:rPr>
+                <w:sz w:val="24"/>
+                <w:szCs w:val="24"/>
+              </w:rPr>
+              <w:t>I</w:t>
+            </w:r>
+            <w:r>
+              <w:rPr>
+                <w:sz w:val="24"/>
+                <w:szCs w:val="24"/>
+              </w:rPr>
+              <w:t xml:space="preserve"> born before his mother’s reign began?”</w:t>
             </w:r>
             <w:r>
               <w:rPr>
@@ -2079,7 +2107,35 @@
                 <w:sz w:val="24"/>
                 <w:szCs w:val="24"/>
               </w:rPr>
-              <w:t>In this case the retriever the keywords “III / born / mother / reign” matched multiple monarch pages but none of the pages needed. The page for Charles II is 149k long.</w:t>
+              <w:t xml:space="preserve">In this case the retriever </w:t>
+            </w:r>
+            <w:r>
+              <w:rPr>
+                <w:sz w:val="24"/>
+                <w:szCs w:val="24"/>
+              </w:rPr>
+              <w:t xml:space="preserve">matched </w:t>
+            </w:r>
+            <w:r>
+              <w:rPr>
+                <w:sz w:val="24"/>
+                <w:szCs w:val="24"/>
+              </w:rPr>
+              <w:t>the keywords “III / born / mother / reign” matched multiple monarch pages but none of the pages needed. The page for Charles II</w:t>
+            </w:r>
+            <w:r>
+              <w:rPr>
+                <w:sz w:val="24"/>
+                <w:szCs w:val="24"/>
+              </w:rPr>
+              <w:t>I</w:t>
+            </w:r>
+            <w:r>
+              <w:rPr>
+                <w:sz w:val="24"/>
+                <w:szCs w:val="24"/>
+              </w:rPr>
+              <w:t xml:space="preserve"> is 149k long.</w:t>
             </w:r>
             <w:r>
               <w:rPr>
@@ -2611,7 +2667,7 @@
                 <w:sz w:val="24"/>
                 <w:szCs w:val="24"/>
               </w:rPr>
-              <w:t xml:space="preserve"> ends up surfacing many </w:t>
+              <w:t xml:space="preserve"> end up surfacing many </w:t>
             </w:r>
             <w:r>
               <w:rPr>
@@ -3430,14 +3486,21 @@
                 <w:sz w:val="24"/>
                 <w:szCs w:val="24"/>
               </w:rPr>
-              <w:t>I made two major architecture changes to</w:t>
-            </w:r>
-            <w:r>
-              <w:rPr>
-                <w:sz w:val="24"/>
-                <w:szCs w:val="24"/>
-              </w:rPr>
-              <w:t xml:space="preserve"> the Checkpoint 3.1 script:</w:t>
+              <w:t xml:space="preserve">I made </w:t>
+            </w:r>
+            <w:r>
+              <w:rPr>
+                <w:sz w:val="24"/>
+                <w:szCs w:val="24"/>
+              </w:rPr>
+              <w:t>two major changes: one to the Checkpoint 2.1 extraction module, one to the evaluation script carried over from Checkpoint 3.1</w:t>
+            </w:r>
+            <w:r>
+              <w:rPr>
+                <w:sz w:val="24"/>
+                <w:szCs w:val="24"/>
+              </w:rPr>
+              <w:t>:</w:t>
             </w:r>
             <w:r>
               <w:rPr>
@@ -3452,7 +3515,21 @@
                 <w:szCs w:val="24"/>
               </w:rPr>
               <w:br/>
-              <w:t xml:space="preserve">(1) amended the pdf extraction </w:t>
+              <w:t xml:space="preserve">(1) amended the </w:t>
+            </w:r>
+            <w:r>
+              <w:rPr>
+                <w:sz w:val="24"/>
+                <w:szCs w:val="24"/>
+              </w:rPr>
+              <w:t>HTML</w:t>
+            </w:r>
+            <w:r>
+              <w:rPr>
+                <w:sz w:val="24"/>
+                <w:szCs w:val="24"/>
+              </w:rPr>
+              <w:t xml:space="preserve"> extraction </w:t>
             </w:r>
             <w:r>
               <w:rPr>
@@ -3488,6 +3565,43 @@
                 <w:sz w:val="24"/>
                 <w:szCs w:val="24"/>
               </w:rPr>
+              <w:t>process_wikipedia_with_nodes_and_edges</w:t>
+            </w:r>
+            <w:proofErr w:type="spellEnd"/>
+            <w:r>
+              <w:rPr>
+                <w:sz w:val="24"/>
+                <w:szCs w:val="24"/>
+              </w:rPr>
+              <w:t xml:space="preserve">) </w:t>
+            </w:r>
+            <w:r>
+              <w:rPr>
+                <w:sz w:val="24"/>
+                <w:szCs w:val="24"/>
+              </w:rPr>
+              <w:t xml:space="preserve">to add to the basic text extraction </w:t>
+            </w:r>
+            <w:r>
+              <w:rPr>
+                <w:sz w:val="24"/>
+                <w:szCs w:val="24"/>
+              </w:rPr>
+              <w:t>per document</w:t>
+            </w:r>
+            <w:r>
+              <w:rPr>
+                <w:sz w:val="24"/>
+                <w:szCs w:val="24"/>
+              </w:rPr>
+              <w:t xml:space="preserve"> (</w:t>
+            </w:r>
+            <w:proofErr w:type="spellStart"/>
+            <w:r>
+              <w:rPr>
+                <w:sz w:val="24"/>
+                <w:szCs w:val="24"/>
+              </w:rPr>
               <w:t>extract_wikipedia_text</w:t>
             </w:r>
             <w:proofErr w:type="spellEnd"/>
@@ -3496,28 +3610,42 @@
                 <w:sz w:val="24"/>
                 <w:szCs w:val="24"/>
               </w:rPr>
-              <w:t xml:space="preserve">) </w:t>
-            </w:r>
-            <w:r>
-              <w:rPr>
-                <w:sz w:val="24"/>
-                <w:szCs w:val="24"/>
-              </w:rPr>
-              <w:t xml:space="preserve">to add to the basic text extraction </w:t>
-            </w:r>
-            <w:r>
-              <w:rPr>
-                <w:sz w:val="24"/>
-                <w:szCs w:val="24"/>
-              </w:rPr>
-              <w:t>per document</w:t>
-            </w:r>
-            <w:r>
-              <w:rPr>
-                <w:sz w:val="24"/>
-                <w:szCs w:val="24"/>
-              </w:rPr>
-              <w:t xml:space="preserve"> (</w:t>
+              <w:t>)</w:t>
+            </w:r>
+            <w:r>
+              <w:rPr>
+                <w:sz w:val="24"/>
+                <w:szCs w:val="24"/>
+              </w:rPr>
+              <w:t xml:space="preserve">. The new function </w:t>
+            </w:r>
+            <w:r>
+              <w:rPr>
+                <w:sz w:val="24"/>
+                <w:szCs w:val="24"/>
+              </w:rPr>
+              <w:t xml:space="preserve">does </w:t>
+            </w:r>
+            <w:r>
+              <w:rPr>
+                <w:sz w:val="24"/>
+                <w:szCs w:val="24"/>
+              </w:rPr>
+              <w:t xml:space="preserve">text splitting </w:t>
+            </w:r>
+            <w:r>
+              <w:rPr>
+                <w:sz w:val="24"/>
+                <w:szCs w:val="24"/>
+              </w:rPr>
+              <w:t xml:space="preserve">and chunking </w:t>
+            </w:r>
+            <w:r>
+              <w:rPr>
+                <w:sz w:val="24"/>
+                <w:szCs w:val="24"/>
+              </w:rPr>
+              <w:t xml:space="preserve">using </w:t>
             </w:r>
             <w:proofErr w:type="spellStart"/>
             <w:r>
@@ -3525,7 +3653,14 @@
                 <w:sz w:val="24"/>
                 <w:szCs w:val="24"/>
               </w:rPr>
-              <w:t>extract_wikipedia_text</w:t>
+              <w:t>LangChain</w:t>
+            </w:r>
+            <w:r>
+              <w:rPr>
+                <w:sz w:val="24"/>
+                <w:szCs w:val="24"/>
+              </w:rPr>
+              <w:t>’s</w:t>
             </w:r>
             <w:proofErr w:type="spellEnd"/>
             <w:r>
@@ -3533,6 +3668,53 @@
                 <w:sz w:val="24"/>
                 <w:szCs w:val="24"/>
               </w:rPr>
+              <w:t xml:space="preserve"> </w:t>
+            </w:r>
+            <w:proofErr w:type="spellStart"/>
+            <w:r>
+              <w:rPr>
+                <w:sz w:val="24"/>
+                <w:szCs w:val="24"/>
+              </w:rPr>
+              <w:t>MarkdownHeaderTextSplitter</w:t>
+            </w:r>
+            <w:proofErr w:type="spellEnd"/>
+            <w:r>
+              <w:rPr>
+                <w:sz w:val="24"/>
+                <w:szCs w:val="24"/>
+              </w:rPr>
+              <w:t xml:space="preserve"> (to capture headings)</w:t>
+            </w:r>
+            <w:r>
+              <w:rPr>
+                <w:sz w:val="24"/>
+                <w:szCs w:val="24"/>
+              </w:rPr>
+              <w:t xml:space="preserve"> and </w:t>
+            </w:r>
+            <w:proofErr w:type="spellStart"/>
+            <w:r>
+              <w:rPr>
+                <w:sz w:val="24"/>
+                <w:szCs w:val="24"/>
+              </w:rPr>
+              <w:t>RecursiveCharacterTextSplitter</w:t>
+            </w:r>
+            <w:proofErr w:type="spellEnd"/>
+            <w:r>
+              <w:rPr>
+                <w:sz w:val="24"/>
+                <w:szCs w:val="24"/>
+              </w:rPr>
+              <w:t xml:space="preserve"> (for long text</w:t>
+            </w:r>
+            <w:proofErr w:type="gramStart"/>
+            <w:r>
+              <w:rPr>
+                <w:sz w:val="24"/>
+                <w:szCs w:val="24"/>
+              </w:rPr>
               <w:t>)</w:t>
             </w:r>
             <w:r>
@@ -3540,35 +3722,43 @@
                 <w:sz w:val="24"/>
                 <w:szCs w:val="24"/>
               </w:rPr>
-              <w:t xml:space="preserve">. The new function </w:t>
-            </w:r>
-            <w:r>
-              <w:rPr>
-                <w:sz w:val="24"/>
-                <w:szCs w:val="24"/>
-              </w:rPr>
-              <w:t xml:space="preserve">does </w:t>
-            </w:r>
-            <w:r>
-              <w:rPr>
-                <w:sz w:val="24"/>
-                <w:szCs w:val="24"/>
-              </w:rPr>
-              <w:t xml:space="preserve">text splitting </w:t>
-            </w:r>
-            <w:r>
-              <w:rPr>
-                <w:sz w:val="24"/>
-                <w:szCs w:val="24"/>
-              </w:rPr>
-              <w:t xml:space="preserve">and chunking </w:t>
-            </w:r>
-            <w:r>
-              <w:rPr>
-                <w:sz w:val="24"/>
-                <w:szCs w:val="24"/>
-              </w:rPr>
-              <w:t xml:space="preserve">using </w:t>
+              <w:t>,</w:t>
+            </w:r>
+            <w:r>
+              <w:rPr>
+                <w:sz w:val="24"/>
+                <w:szCs w:val="24"/>
+              </w:rPr>
+              <w:t xml:space="preserve"> and</w:t>
+            </w:r>
+            <w:proofErr w:type="gramEnd"/>
+            <w:r>
+              <w:rPr>
+                <w:sz w:val="24"/>
+                <w:szCs w:val="24"/>
+              </w:rPr>
+              <w:t xml:space="preserve"> uses Beautiful Soup to</w:t>
+            </w:r>
+            <w:r>
+              <w:rPr>
+                <w:sz w:val="24"/>
+                <w:szCs w:val="24"/>
+              </w:rPr>
+              <w:t xml:space="preserve"> extract some of the semantic properties s</w:t>
+            </w:r>
+            <w:r>
+              <w:rPr>
+                <w:sz w:val="24"/>
+                <w:szCs w:val="24"/>
+              </w:rPr>
+              <w:t>u</w:t>
+            </w:r>
+            <w:r>
+              <w:rPr>
+                <w:sz w:val="24"/>
+                <w:szCs w:val="24"/>
+              </w:rPr>
+              <w:t xml:space="preserve">ch as </w:t>
             </w:r>
             <w:proofErr w:type="spellStart"/>
             <w:r>
@@ -3576,14 +3766,7 @@
                 <w:sz w:val="24"/>
                 <w:szCs w:val="24"/>
               </w:rPr>
-              <w:t>LangChain</w:t>
-            </w:r>
-            <w:r>
-              <w:rPr>
-                <w:sz w:val="24"/>
-                <w:szCs w:val="24"/>
-              </w:rPr>
-              <w:t>’s</w:t>
+              <w:t>Wikilinks</w:t>
             </w:r>
             <w:proofErr w:type="spellEnd"/>
             <w:r>
@@ -3591,15 +3774,173 @@
                 <w:sz w:val="24"/>
                 <w:szCs w:val="24"/>
               </w:rPr>
+              <w:t xml:space="preserve">, categories, and </w:t>
+            </w:r>
+            <w:proofErr w:type="spellStart"/>
+            <w:r>
+              <w:rPr>
+                <w:sz w:val="24"/>
+                <w:szCs w:val="24"/>
+              </w:rPr>
+              <w:t>infoboxes</w:t>
+            </w:r>
+            <w:proofErr w:type="spellEnd"/>
+            <w:r>
+              <w:rPr>
+                <w:sz w:val="24"/>
+                <w:szCs w:val="24"/>
+              </w:rPr>
+              <w:t>, to generate graph data (nodes and edges) for later use</w:t>
+            </w:r>
+            <w:r>
+              <w:rPr>
+                <w:sz w:val="24"/>
+                <w:szCs w:val="24"/>
+              </w:rPr>
+              <w:t xml:space="preserve"> in building a network graph. </w:t>
+            </w:r>
+            <w:r>
+              <w:rPr>
+                <w:sz w:val="24"/>
+                <w:szCs w:val="24"/>
+              </w:rPr>
+              <w:br/>
+            </w:r>
+            <w:r>
+              <w:rPr>
+                <w:sz w:val="24"/>
+                <w:szCs w:val="24"/>
+              </w:rPr>
+              <w:br/>
+            </w:r>
+            <w:r>
+              <w:rPr>
+                <w:sz w:val="24"/>
+                <w:szCs w:val="24"/>
+              </w:rPr>
+              <w:t xml:space="preserve">(2) amended the </w:t>
+            </w:r>
+            <w:r>
+              <w:rPr>
+                <w:sz w:val="24"/>
+                <w:szCs w:val="24"/>
+              </w:rPr>
+              <w:t xml:space="preserve">script to be run with </w:t>
+            </w:r>
+            <w:r>
+              <w:rPr>
+                <w:sz w:val="24"/>
+                <w:szCs w:val="24"/>
+              </w:rPr>
+              <w:t xml:space="preserve">one of </w:t>
+            </w:r>
+            <w:r>
+              <w:rPr>
+                <w:sz w:val="24"/>
+                <w:szCs w:val="24"/>
+              </w:rPr>
+              <w:t>four different retrievers</w:t>
+            </w:r>
+            <w:r>
+              <w:rPr>
+                <w:sz w:val="24"/>
+                <w:szCs w:val="24"/>
+              </w:rPr>
+              <w:t xml:space="preserve"> (baseline, chunks, decompose, graph) using the –retriever </w:t>
+            </w:r>
+            <w:r>
+              <w:rPr>
+                <w:sz w:val="24"/>
+                <w:szCs w:val="24"/>
+              </w:rPr>
+              <w:t xml:space="preserve">argument. The baseline retriever is just the same code as the 3.1 checkpoint. The </w:t>
+            </w:r>
+            <w:r>
+              <w:rPr>
+                <w:sz w:val="24"/>
+                <w:szCs w:val="24"/>
+              </w:rPr>
+              <w:t xml:space="preserve">other </w:t>
+            </w:r>
+            <w:r>
+              <w:rPr>
+                <w:sz w:val="24"/>
+                <w:szCs w:val="24"/>
+              </w:rPr>
+              <w:t>retriever</w:t>
+            </w:r>
+            <w:r>
+              <w:rPr>
+                <w:sz w:val="24"/>
+                <w:szCs w:val="24"/>
+              </w:rPr>
+              <w:t>s</w:t>
+            </w:r>
+            <w:r>
+              <w:rPr>
+                <w:sz w:val="24"/>
+                <w:szCs w:val="24"/>
+              </w:rPr>
+              <w:t xml:space="preserve"> use </w:t>
+            </w:r>
+            <w:proofErr w:type="spellStart"/>
+            <w:r>
+              <w:rPr>
+                <w:sz w:val="24"/>
+                <w:szCs w:val="24"/>
+              </w:rPr>
+              <w:t>process_wikipedia_with_nodes_and_edges</w:t>
+            </w:r>
+            <w:proofErr w:type="spellEnd"/>
+            <w:r>
+              <w:rPr>
+                <w:sz w:val="24"/>
+                <w:szCs w:val="24"/>
+              </w:rPr>
+              <w:t xml:space="preserve">. </w:t>
+            </w:r>
+            <w:r>
+              <w:rPr>
+                <w:sz w:val="24"/>
+                <w:szCs w:val="24"/>
+              </w:rPr>
+              <w:t>If the script is called with “chunks” then a chunk index and chunk vector store is created</w:t>
+            </w:r>
+            <w:r>
+              <w:rPr>
+                <w:sz w:val="24"/>
+                <w:szCs w:val="24"/>
+              </w:rPr>
+              <w:t xml:space="preserve"> and used for retrieval</w:t>
+            </w:r>
+            <w:r>
+              <w:rPr>
+                <w:sz w:val="24"/>
+                <w:szCs w:val="24"/>
+              </w:rPr>
+              <w:t>, which adopts a parent-child retriever model</w:t>
+            </w:r>
+            <w:r>
+              <w:rPr>
+                <w:sz w:val="24"/>
+                <w:szCs w:val="24"/>
+              </w:rPr>
               <w:t xml:space="preserve"> </w:t>
             </w:r>
+            <w:r>
+              <w:rPr>
+                <w:sz w:val="24"/>
+                <w:szCs w:val="24"/>
+              </w:rPr>
+              <w:t xml:space="preserve">configured in these runs with --parent </w:t>
+            </w:r>
             <w:proofErr w:type="spellStart"/>
             <w:r>
               <w:rPr>
                 <w:sz w:val="24"/>
                 <w:szCs w:val="24"/>
               </w:rPr>
-              <w:t>MarkdownHeaderTextSplitter</w:t>
+              <w:t>lead_section</w:t>
             </w:r>
             <w:proofErr w:type="spellEnd"/>
             <w:r>
@@ -3607,14 +3948,7 @@
                 <w:sz w:val="24"/>
                 <w:szCs w:val="24"/>
               </w:rPr>
-              <w:t xml:space="preserve"> (to capture headings)</w:t>
-            </w:r>
-            <w:r>
-              <w:rPr>
-                <w:sz w:val="24"/>
-                <w:szCs w:val="24"/>
-              </w:rPr>
-              <w:t xml:space="preserve"> and </w:t>
+              <w:t xml:space="preserve">, which extracts the chunk that got the hit together with the rest of its section, plus the article's lead chunks and </w:t>
             </w:r>
             <w:proofErr w:type="spellStart"/>
             <w:r>
@@ -3622,248 +3956,9 @@
                 <w:sz w:val="24"/>
                 <w:szCs w:val="24"/>
               </w:rPr>
-              <w:t>RecursiveCharacterTextSplitter</w:t>
+              <w:t>infobox</w:t>
             </w:r>
             <w:proofErr w:type="spellEnd"/>
-            <w:r>
-              <w:rPr>
-                <w:sz w:val="24"/>
-                <w:szCs w:val="24"/>
-              </w:rPr>
-              <w:t xml:space="preserve"> (for long text</w:t>
-            </w:r>
-            <w:proofErr w:type="gramStart"/>
-            <w:r>
-              <w:rPr>
-                <w:sz w:val="24"/>
-                <w:szCs w:val="24"/>
-              </w:rPr>
-              <w:t>)</w:t>
-            </w:r>
-            <w:r>
-              <w:rPr>
-                <w:sz w:val="24"/>
-                <w:szCs w:val="24"/>
-              </w:rPr>
-              <w:t>,</w:t>
-            </w:r>
-            <w:r>
-              <w:rPr>
-                <w:sz w:val="24"/>
-                <w:szCs w:val="24"/>
-              </w:rPr>
-              <w:t xml:space="preserve"> and</w:t>
-            </w:r>
-            <w:proofErr w:type="gramEnd"/>
-            <w:r>
-              <w:rPr>
-                <w:sz w:val="24"/>
-                <w:szCs w:val="24"/>
-              </w:rPr>
-              <w:t xml:space="preserve"> uses Beautiful Soup to</w:t>
-            </w:r>
-            <w:r>
-              <w:rPr>
-                <w:sz w:val="24"/>
-                <w:szCs w:val="24"/>
-              </w:rPr>
-              <w:t xml:space="preserve"> extract some of the semantic properties s</w:t>
-            </w:r>
-            <w:r>
-              <w:rPr>
-                <w:sz w:val="24"/>
-                <w:szCs w:val="24"/>
-              </w:rPr>
-              <w:t>u</w:t>
-            </w:r>
-            <w:r>
-              <w:rPr>
-                <w:sz w:val="24"/>
-                <w:szCs w:val="24"/>
-              </w:rPr>
-              <w:t xml:space="preserve">ch as </w:t>
-            </w:r>
-            <w:proofErr w:type="spellStart"/>
-            <w:r>
-              <w:rPr>
-                <w:sz w:val="24"/>
-                <w:szCs w:val="24"/>
-              </w:rPr>
-              <w:t>Wikilinks</w:t>
-            </w:r>
-            <w:proofErr w:type="spellEnd"/>
-            <w:r>
-              <w:rPr>
-                <w:sz w:val="24"/>
-                <w:szCs w:val="24"/>
-              </w:rPr>
-              <w:t xml:space="preserve">, categories, and </w:t>
-            </w:r>
-            <w:proofErr w:type="spellStart"/>
-            <w:r>
-              <w:rPr>
-                <w:sz w:val="24"/>
-                <w:szCs w:val="24"/>
-              </w:rPr>
-              <w:t>infoboxes</w:t>
-            </w:r>
-            <w:proofErr w:type="spellEnd"/>
-            <w:r>
-              <w:rPr>
-                <w:sz w:val="24"/>
-                <w:szCs w:val="24"/>
-              </w:rPr>
-              <w:t>, to generate graph data (nodes and edges) for later use</w:t>
-            </w:r>
-            <w:r>
-              <w:rPr>
-                <w:sz w:val="24"/>
-                <w:szCs w:val="24"/>
-              </w:rPr>
-              <w:t xml:space="preserve"> in building a network graph. </w:t>
-            </w:r>
-            <w:r>
-              <w:rPr>
-                <w:sz w:val="24"/>
-                <w:szCs w:val="24"/>
-              </w:rPr>
-              <w:br/>
-            </w:r>
-            <w:r>
-              <w:rPr>
-                <w:sz w:val="24"/>
-                <w:szCs w:val="24"/>
-              </w:rPr>
-              <w:br/>
-            </w:r>
-            <w:r>
-              <w:rPr>
-                <w:sz w:val="24"/>
-                <w:szCs w:val="24"/>
-              </w:rPr>
-              <w:t xml:space="preserve">(2) amended the </w:t>
-            </w:r>
-            <w:r>
-              <w:rPr>
-                <w:sz w:val="24"/>
-                <w:szCs w:val="24"/>
-              </w:rPr>
-              <w:t xml:space="preserve">script to be run with </w:t>
-            </w:r>
-            <w:r>
-              <w:rPr>
-                <w:sz w:val="24"/>
-                <w:szCs w:val="24"/>
-              </w:rPr>
-              <w:t xml:space="preserve">one of </w:t>
-            </w:r>
-            <w:r>
-              <w:rPr>
-                <w:sz w:val="24"/>
-                <w:szCs w:val="24"/>
-              </w:rPr>
-              <w:t>four different retrievers</w:t>
-            </w:r>
-            <w:r>
-              <w:rPr>
-                <w:sz w:val="24"/>
-                <w:szCs w:val="24"/>
-              </w:rPr>
-              <w:t xml:space="preserve"> (baseline, chunks, decompose, graph) using the –retriever </w:t>
-            </w:r>
-            <w:r>
-              <w:rPr>
-                <w:sz w:val="24"/>
-                <w:szCs w:val="24"/>
-              </w:rPr>
-              <w:t xml:space="preserve">argument. The baseline retriever is just the same code as the 3.1 checkpoint. The </w:t>
-            </w:r>
-            <w:r>
-              <w:rPr>
-                <w:sz w:val="24"/>
-                <w:szCs w:val="24"/>
-              </w:rPr>
-              <w:t xml:space="preserve">other </w:t>
-            </w:r>
-            <w:r>
-              <w:rPr>
-                <w:sz w:val="24"/>
-                <w:szCs w:val="24"/>
-              </w:rPr>
-              <w:t>retriever</w:t>
-            </w:r>
-            <w:r>
-              <w:rPr>
-                <w:sz w:val="24"/>
-                <w:szCs w:val="24"/>
-              </w:rPr>
-              <w:t>s</w:t>
-            </w:r>
-            <w:r>
-              <w:rPr>
-                <w:sz w:val="24"/>
-                <w:szCs w:val="24"/>
-              </w:rPr>
-              <w:t xml:space="preserve"> use </w:t>
-            </w:r>
-            <w:proofErr w:type="spellStart"/>
-            <w:r>
-              <w:rPr>
-                <w:sz w:val="24"/>
-                <w:szCs w:val="24"/>
-              </w:rPr>
-              <w:t>process_wikipedia_with_nodes_and_edges</w:t>
-            </w:r>
-            <w:proofErr w:type="spellEnd"/>
-            <w:r>
-              <w:rPr>
-                <w:sz w:val="24"/>
-                <w:szCs w:val="24"/>
-              </w:rPr>
-              <w:t xml:space="preserve">. </w:t>
-            </w:r>
-            <w:r>
-              <w:rPr>
-                <w:sz w:val="24"/>
-                <w:szCs w:val="24"/>
-              </w:rPr>
-              <w:t>If the script is called with “chunks” then a chunk index and chunk vector store is created</w:t>
-            </w:r>
-            <w:r>
-              <w:rPr>
-                <w:sz w:val="24"/>
-                <w:szCs w:val="24"/>
-              </w:rPr>
-              <w:t xml:space="preserve"> and used for retrieval</w:t>
-            </w:r>
-            <w:r>
-              <w:rPr>
-                <w:sz w:val="24"/>
-                <w:szCs w:val="24"/>
-              </w:rPr>
-              <w:t>, which adopts a parent-child retriever model</w:t>
-            </w:r>
-            <w:r>
-              <w:rPr>
-                <w:sz w:val="24"/>
-                <w:szCs w:val="24"/>
-              </w:rPr>
-              <w:t xml:space="preserve"> configured by default to extract the chunk that got the hit, neighboring chunks, plus the leading chunk and associated </w:t>
-            </w:r>
-            <w:r>
-              <w:rPr>
-                <w:sz w:val="24"/>
-                <w:szCs w:val="24"/>
-              </w:rPr>
-              <w:t>info box</w:t>
-            </w:r>
-            <w:r>
-              <w:rPr>
-                <w:sz w:val="24"/>
-                <w:szCs w:val="24"/>
-              </w:rPr>
-              <w:t xml:space="preserve"> for the Wikipedia article</w:t>
-            </w:r>
             <w:r>
               <w:rPr>
                 <w:sz w:val="24"/>
@@ -4011,7 +4106,6 @@
                 <w:sz w:val="24"/>
                 <w:szCs w:val="24"/>
               </w:rPr>
-              <w:lastRenderedPageBreak/>
               <w:t>Implementation evidence (e.g., screenshots, code snippets, retrieval outputs, notebook excerpts)</w:t>
             </w:r>
           </w:p>
@@ -7093,9 +7187,8 @@
           <w:sz w:val="24"/>
           <w:szCs w:val="24"/>
         </w:rPr>
-        <w:t xml:space="preserve">, but only the graph retriever fared better at correctness, even though its precision dropped significantly, and the chunk retriever </w:t>
+        <w:t xml:space="preserve">, but only the graph retriever fared better at </w:t>
       </w:r>
-      <w:proofErr w:type="gramStart"/>
       <w:r>
         <w:rPr>
           <w:rFonts w:eastAsia="Aptos"/>
@@ -7103,9 +7196,8 @@
           <w:sz w:val="24"/>
           <w:szCs w:val="24"/>
         </w:rPr>
-        <w:t>actually fared</w:t>
+        <w:t xml:space="preserve">binary </w:t>
       </w:r>
-      <w:proofErr w:type="gramEnd"/>
       <w:r>
         <w:rPr>
           <w:rFonts w:eastAsia="Aptos"/>
@@ -7113,7 +7205,61 @@
           <w:sz w:val="24"/>
           <w:szCs w:val="24"/>
         </w:rPr>
-        <w:t xml:space="preserve"> worse on correctness. </w:t>
+        <w:t xml:space="preserve">correctness, even though its precision dropped significantly, </w:t>
+      </w:r>
+      <w:r>
+        <w:rPr>
+          <w:rFonts w:eastAsia="Aptos"/>
+          <w:color w:val="000000"/>
+          <w:sz w:val="24"/>
+          <w:szCs w:val="24"/>
+        </w:rPr>
+        <w:t>while</w:t>
+      </w:r>
+      <w:r>
+        <w:rPr>
+          <w:rFonts w:eastAsia="Aptos"/>
+          <w:color w:val="000000"/>
+          <w:sz w:val="24"/>
+          <w:szCs w:val="24"/>
+        </w:rPr>
+        <w:t xml:space="preserve"> the decompose retriever fared better at graded correctness (0.47 to 0.56)</w:t>
+      </w:r>
+      <w:r>
+        <w:rPr>
+          <w:rFonts w:eastAsia="Aptos"/>
+          <w:color w:val="000000"/>
+          <w:sz w:val="24"/>
+          <w:szCs w:val="24"/>
+        </w:rPr>
+        <w:t xml:space="preserve">, </w:t>
+      </w:r>
+      <w:r>
+        <w:rPr>
+          <w:rFonts w:eastAsia="Aptos"/>
+          <w:color w:val="000000"/>
+          <w:sz w:val="24"/>
+          <w:szCs w:val="24"/>
+        </w:rPr>
+        <w:t xml:space="preserve">and the chunk retriever actually fared worse on </w:t>
+      </w:r>
+      <w:r>
+        <w:rPr>
+          <w:rFonts w:eastAsia="Aptos"/>
+          <w:color w:val="000000"/>
+          <w:sz w:val="24"/>
+          <w:szCs w:val="24"/>
+        </w:rPr>
+        <w:t xml:space="preserve">binary </w:t>
+      </w:r>
+      <w:r>
+        <w:rPr>
+          <w:rFonts w:eastAsia="Aptos"/>
+          <w:color w:val="000000"/>
+          <w:sz w:val="24"/>
+          <w:szCs w:val="24"/>
+        </w:rPr>
+        <w:t xml:space="preserve">correctness. </w:t>
       </w:r>
       <w:r>
         <w:rPr>
@@ -7131,7 +7277,43 @@
           <w:sz w:val="24"/>
           <w:szCs w:val="24"/>
         </w:rPr>
-        <w:t xml:space="preserve"> and evidence recall (citations).</w:t>
+        <w:t xml:space="preserve"> and evidence recall (</w:t>
+      </w:r>
+      <w:r>
+        <w:rPr>
+          <w:rFonts w:eastAsia="Aptos"/>
+          <w:color w:val="000000"/>
+          <w:sz w:val="24"/>
+          <w:szCs w:val="24"/>
+        </w:rPr>
+        <w:t>golden quotes</w:t>
+      </w:r>
+      <w:r>
+        <w:rPr>
+          <w:rFonts w:eastAsia="Aptos"/>
+          <w:color w:val="000000"/>
+          <w:sz w:val="24"/>
+          <w:szCs w:val="24"/>
+        </w:rPr>
+        <w:t>)</w:t>
+      </w:r>
+      <w:r>
+        <w:rPr>
+          <w:rFonts w:eastAsia="Aptos"/>
+          <w:color w:val="000000"/>
+          <w:sz w:val="24"/>
+          <w:szCs w:val="24"/>
+        </w:rPr>
+        <w:t xml:space="preserve"> and citation precision</w:t>
+      </w:r>
+      <w:r>
+        <w:rPr>
+          <w:rFonts w:eastAsia="Aptos"/>
+          <w:color w:val="000000"/>
+          <w:sz w:val="24"/>
+          <w:szCs w:val="24"/>
+        </w:rPr>
+        <w:t>.</w:t>
       </w:r>
       <w:r>
         <w:rPr>
@@ -7238,7 +7420,21 @@
                 <w:sz w:val="24"/>
                 <w:szCs w:val="24"/>
               </w:rPr>
-              <w:t>G16 “Was Charles II born before his mother’s reign began?”</w:t>
+              <w:t>G16 “Was Charles II</w:t>
+            </w:r>
+            <w:r>
+              <w:rPr>
+                <w:sz w:val="24"/>
+                <w:szCs w:val="24"/>
+              </w:rPr>
+              <w:t>I</w:t>
+            </w:r>
+            <w:r>
+              <w:rPr>
+                <w:sz w:val="24"/>
+                <w:szCs w:val="24"/>
+              </w:rPr>
+              <w:t xml:space="preserve"> born before his mother’s reign began?”</w:t>
             </w:r>
           </w:p>
           <w:p>
@@ -7354,6 +7550,41 @@
                 <w:sz w:val="24"/>
                 <w:szCs w:val="24"/>
               </w:rPr>
+              <w:t>recall</w:t>
+            </w:r>
+            <w:r>
+              <w:rPr>
+                <w:sz w:val="24"/>
+                <w:szCs w:val="24"/>
+              </w:rPr>
+              <w:t xml:space="preserve"> flipped from 0 to 1 while </w:t>
+            </w:r>
+            <w:r>
+              <w:rPr>
+                <w:sz w:val="24"/>
+                <w:szCs w:val="24"/>
+              </w:rPr>
+              <w:t xml:space="preserve">precision went from 0.0 to 0.5. </w:t>
+            </w:r>
+            <w:r>
+              <w:rPr>
+                <w:sz w:val="24"/>
+                <w:szCs w:val="24"/>
+              </w:rPr>
+              <w:t>T</w:t>
+            </w:r>
+            <w:r>
+              <w:rPr>
+                <w:sz w:val="24"/>
+                <w:szCs w:val="24"/>
+              </w:rPr>
+              <w:t xml:space="preserve">he retrieved context </w:t>
+            </w:r>
+            <w:r>
+              <w:rPr>
+                <w:sz w:val="24"/>
+                <w:szCs w:val="24"/>
+              </w:rPr>
               <w:t xml:space="preserve">this time </w:t>
             </w:r>
             <w:r>
@@ -7361,28 +7592,35 @@
                 <w:sz w:val="24"/>
                 <w:szCs w:val="24"/>
               </w:rPr>
-              <w:t>recall</w:t>
-            </w:r>
-            <w:r>
-              <w:rPr>
-                <w:sz w:val="24"/>
-                <w:szCs w:val="24"/>
-              </w:rPr>
-              <w:t xml:space="preserve"> flipped from 0 to 1 while </w:t>
-            </w:r>
-            <w:r>
-              <w:rPr>
-                <w:sz w:val="24"/>
-                <w:szCs w:val="24"/>
-              </w:rPr>
-              <w:t xml:space="preserve">precision went from 0.0 to 0.5. </w:t>
-            </w:r>
-            <w:r>
-              <w:rPr>
-                <w:sz w:val="24"/>
-                <w:szCs w:val="24"/>
-              </w:rPr>
-              <w:t xml:space="preserve">All the chunks required to answer the question were now there for the LLM, which still </w:t>
+              <w:t>contained the birth date and the accession year</w:t>
+            </w:r>
+            <w:r>
+              <w:rPr>
+                <w:sz w:val="24"/>
+                <w:szCs w:val="24"/>
+              </w:rPr>
+              <w:t>. Despite this</w:t>
+            </w:r>
+            <w:r>
+              <w:rPr>
+                <w:sz w:val="24"/>
+                <w:szCs w:val="24"/>
+              </w:rPr>
+              <w:t>,</w:t>
+            </w:r>
+            <w:r>
+              <w:rPr>
+                <w:sz w:val="24"/>
+                <w:szCs w:val="24"/>
+              </w:rPr>
+              <w:t xml:space="preserve"> </w:t>
+            </w:r>
+            <w:r>
+              <w:rPr>
+                <w:sz w:val="24"/>
+                <w:szCs w:val="24"/>
+              </w:rPr>
+              <w:t xml:space="preserve">the system </w:t>
             </w:r>
             <w:r>
               <w:rPr>
@@ -7930,7 +8168,7 @@
               </w:rPr>
               <w:lastRenderedPageBreak/>
               <w:drawing>
-                <wp:inline distT="0" distB="0" distL="0" distR="0" wp14:anchorId="5E780BA0" wp14:editId="360EFCA2">
+                <wp:inline distT="0" distB="0" distL="0" distR="0" wp14:anchorId="5E780BA0" wp14:editId="759577B4">
                   <wp:extent cx="6263640" cy="3115310"/>
                   <wp:effectExtent l="0" t="0" r="3810" b="8890"/>
                   <wp:docPr id="927972698" name="Picture 15"/>
@@ -8904,7 +9142,21 @@
                 <w:sz w:val="24"/>
                 <w:szCs w:val="24"/>
               </w:rPr>
-              <w:t xml:space="preserve"> in two questions on single aspects, and precision dropped significantly for several question using the graph because</w:t>
+              <w:t xml:space="preserve"> in two questions on single aspects, and precision dropped significantly for several question</w:t>
+            </w:r>
+            <w:r>
+              <w:rPr>
+                <w:sz w:val="24"/>
+                <w:szCs w:val="24"/>
+              </w:rPr>
+              <w:t>s</w:t>
+            </w:r>
+            <w:r>
+              <w:rPr>
+                <w:sz w:val="24"/>
+                <w:szCs w:val="24"/>
+              </w:rPr>
+              <w:t xml:space="preserve"> using the graph because</w:t>
             </w:r>
             <w:r>
               <w:rPr>
@@ -8946,24 +9198,8 @@
                 <w:sz w:val="24"/>
                 <w:szCs w:val="24"/>
               </w:rPr>
-              <w:t xml:space="preserve">Dynamically expanding parent scope might </w:t>
-            </w:r>
-            <w:proofErr w:type="gramStart"/>
-            <w:r>
-              <w:rPr>
-                <w:sz w:val="24"/>
-                <w:szCs w:val="24"/>
-              </w:rPr>
-              <w:t>fix</w:t>
-            </w:r>
-            <w:r>
-              <w:rPr>
-                <w:sz w:val="24"/>
-                <w:szCs w:val="24"/>
-              </w:rPr>
-              <w:t>ed</w:t>
-            </w:r>
-            <w:proofErr w:type="gramEnd"/>
+              <w:t>Dynamically expanding parent scope might fix</w:t>
+            </w:r>
             <w:r>
               <w:rPr>
                 <w:sz w:val="24"/>
@@ -9011,21 +9247,35 @@
                 <w:sz w:val="24"/>
                 <w:szCs w:val="24"/>
               </w:rPr>
-              <w:t xml:space="preserve">including the LLM accessing its own parametric memory </w:t>
-            </w:r>
-            <w:r>
-              <w:rPr>
-                <w:sz w:val="24"/>
-                <w:szCs w:val="24"/>
-              </w:rPr>
-              <w:t xml:space="preserve">during a decomposition run </w:t>
-            </w:r>
-            <w:r>
-              <w:rPr>
-                <w:sz w:val="24"/>
-                <w:szCs w:val="24"/>
-              </w:rPr>
-              <w:t>to answer sub-queries</w:t>
+              <w:t xml:space="preserve">including the </w:t>
+            </w:r>
+            <w:r>
+              <w:rPr>
+                <w:sz w:val="24"/>
+                <w:szCs w:val="24"/>
+              </w:rPr>
+              <w:t>decomposition step nam</w:t>
+            </w:r>
+            <w:r>
+              <w:rPr>
+                <w:sz w:val="24"/>
+                <w:szCs w:val="24"/>
+              </w:rPr>
+              <w:t>ing</w:t>
+            </w:r>
+            <w:r>
+              <w:rPr>
+                <w:sz w:val="24"/>
+                <w:szCs w:val="24"/>
+              </w:rPr>
+              <w:t xml:space="preserve"> answer entities from the model's own knowledge when writing sub-queries, which chunk attribution detects (0.62 → 0.48)</w:t>
+            </w:r>
+            <w:r>
+              <w:rPr>
+                <w:sz w:val="24"/>
+                <w:szCs w:val="24"/>
+              </w:rPr>
+              <w:t>.</w:t>
             </w:r>
             <w:r>
               <w:rPr>
@@ -9039,20 +9289,6 @@
                 <w:sz w:val="24"/>
                 <w:szCs w:val="24"/>
               </w:rPr>
-              <w:t>despite instructions to the contrary</w:t>
-            </w:r>
-            <w:r>
-              <w:rPr>
-                <w:sz w:val="24"/>
-                <w:szCs w:val="24"/>
-              </w:rPr>
-              <w:t xml:space="preserve">. </w:t>
-            </w:r>
-            <w:r>
-              <w:rPr>
-                <w:sz w:val="24"/>
-                <w:szCs w:val="24"/>
-              </w:rPr>
               <w:t>S</w:t>
             </w:r>
             <w:r>
@@ -9060,15 +9296,7 @@
                 <w:sz w:val="24"/>
                 <w:szCs w:val="24"/>
               </w:rPr>
-              <w:t xml:space="preserve">ome </w:t>
-            </w:r>
-            <w:proofErr w:type="gramStart"/>
-            <w:r>
-              <w:rPr>
-                <w:sz w:val="24"/>
-                <w:szCs w:val="24"/>
-              </w:rPr>
-              <w:t xml:space="preserve">of </w:t>
+              <w:t>ome of</w:t>
             </w:r>
             <w:r>
               <w:rPr>
@@ -9082,9 +9310,36 @@
                 <w:sz w:val="24"/>
                 <w:szCs w:val="24"/>
               </w:rPr>
-              <w:t>these</w:t>
-            </w:r>
-            <w:proofErr w:type="gramEnd"/>
+              <w:t xml:space="preserve">these </w:t>
+            </w:r>
+            <w:r>
+              <w:rPr>
+                <w:sz w:val="24"/>
+                <w:szCs w:val="24"/>
+              </w:rPr>
+              <w:t xml:space="preserve">generation problems </w:t>
+            </w:r>
+            <w:r>
+              <w:rPr>
+                <w:sz w:val="24"/>
+                <w:szCs w:val="24"/>
+              </w:rPr>
+              <w:t xml:space="preserve">could likely be fixed by </w:t>
+            </w:r>
+            <w:r>
+              <w:rPr>
+                <w:sz w:val="24"/>
+                <w:szCs w:val="24"/>
+              </w:rPr>
+              <w:t xml:space="preserve">tightening </w:t>
+            </w:r>
+            <w:r>
+              <w:rPr>
+                <w:sz w:val="24"/>
+                <w:szCs w:val="24"/>
+              </w:rPr>
+              <w:t>prompts</w:t>
+            </w:r>
             <w:r>
               <w:rPr>
                 <w:sz w:val="24"/>
@@ -9097,35 +9352,42 @@
                 <w:sz w:val="24"/>
                 <w:szCs w:val="24"/>
               </w:rPr>
-              <w:t xml:space="preserve">generation problems </w:t>
-            </w:r>
-            <w:r>
-              <w:rPr>
-                <w:sz w:val="24"/>
-                <w:szCs w:val="24"/>
-              </w:rPr>
-              <w:t xml:space="preserve">could likely be fixed by </w:t>
-            </w:r>
-            <w:r>
-              <w:rPr>
-                <w:sz w:val="24"/>
-                <w:szCs w:val="24"/>
-              </w:rPr>
-              <w:t xml:space="preserve">tightening </w:t>
-            </w:r>
-            <w:r>
-              <w:rPr>
-                <w:sz w:val="24"/>
-                <w:szCs w:val="24"/>
-              </w:rPr>
-              <w:t>prompts</w:t>
-            </w:r>
-            <w:r>
-              <w:rPr>
-                <w:sz w:val="24"/>
-                <w:szCs w:val="24"/>
-              </w:rPr>
-              <w:t xml:space="preserve"> and</w:t>
+              <w:t>(</w:t>
+            </w:r>
+            <w:r>
+              <w:rPr>
+                <w:sz w:val="24"/>
+                <w:szCs w:val="24"/>
+              </w:rPr>
+              <w:t xml:space="preserve">e.g. </w:t>
+            </w:r>
+            <w:r>
+              <w:rPr>
+                <w:sz w:val="24"/>
+                <w:szCs w:val="24"/>
+              </w:rPr>
+              <w:t>t</w:t>
+            </w:r>
+            <w:r>
+              <w:rPr>
+                <w:sz w:val="24"/>
+                <w:szCs w:val="24"/>
+              </w:rPr>
+              <w:t>he decomposition prompt doesn't instruct against using prior knowledge</w:t>
+            </w:r>
+            <w:r>
+              <w:rPr>
+                <w:sz w:val="24"/>
+                <w:szCs w:val="24"/>
+              </w:rPr>
+              <w:t xml:space="preserve"> – the answer prompt does) </w:t>
+            </w:r>
+            <w:r>
+              <w:rPr>
+                <w:sz w:val="24"/>
+                <w:szCs w:val="24"/>
+              </w:rPr>
+              <w:t>and</w:t>
             </w:r>
             <w:r>
               <w:rPr>
@@ -13643,6 +13905,7 @@
   <w:style w:type="character" w:default="1" w:styleId="DefaultParagraphFont">
     <w:name w:val="Default Paragraph Font"/>
     <w:uiPriority w:val="1"/>
+    <w:semiHidden/>
     <w:unhideWhenUsed/>
   </w:style>
   <w:style w:type="table" w:default="1" w:styleId="TableNormal">

</xml_diff>